<commit_message>
aggiornamento per la mappa
</commit_message>
<xml_diff>
--- a/Come creare una pagina del sito Paginaxy.docx
+++ b/Come creare una pagina del sito Paginaxy.docx
@@ -5,7 +5,6 @@
     <w:p>
       <w:pPr>
         <w:pStyle w:val="Titolo1"/>
-        <w:jc w:val="both"/>
       </w:pPr>
       <w:bookmarkStart w:id="0" w:name="tit_Come_creare_una_pagina_del_sito_Pagi"/>
       <w:r>
@@ -15375,7 +15374,6 @@
         <w:rPr>
           <w:rFonts w:cs="Miriam Mono CLM"/>
         </w:rPr>
-        <w:lastRenderedPageBreak/>
         <w:t>CALL "%UTILITIES%\salvag.bat" "%REPO_ROOT%\main.js"</w:t>
       </w:r>
     </w:p>
@@ -16546,7 +16544,6 @@
         <w:spacing w:after="0"/>
       </w:pPr>
       <w:r>
-        <w:lastRenderedPageBreak/>
         <w:t>:: Esegue il backup di main.js e dei 4 JSON prima di modificarli</w:t>
       </w:r>
     </w:p>
@@ -16800,7 +16797,6 @@
       </w:pPr>
       <w:bookmarkStart w:id="18" w:name="tit_Esecuzione_della_procedura_add_pagin"/>
       <w:r>
-        <w:lastRenderedPageBreak/>
         <w:t xml:space="preserve">Esecuzione della procedura </w:t>
       </w:r>
       <w:r>
@@ -19110,7 +19106,15 @@
     <w:p/>
     <w:p>
       <w:r>
-        <w:t>Per gestire correttamente la lista di navigazione presente in tutte le pagine html nelle quattro lingue e quella di reindirizzamento usando le procedure previste dallo script add_[</w:t>
+        <w:t xml:space="preserve">Per gestire correttamente la lista di navigazione presente in tutte le pagine html nelle quattro lingue e quella di reindirizzamento usando le procedure previste dallo script </w:t>
+      </w:r>
+      <w:proofErr w:type="spellStart"/>
+      <w:r>
+        <w:t>add</w:t>
+      </w:r>
+      <w:proofErr w:type="spellEnd"/>
+      <w:r>
+        <w:t>_[</w:t>
       </w:r>
       <w:r>
         <w:object w:dxaOrig="1520" w:dyaOrig="985" w14:anchorId="1178EBB9">
@@ -19136,7 +19140,7 @@
           <v:shape id="_x0000_i1025" type="#_x0000_t75" style="width:76.2pt;height:49.2pt" o:ole="">
             <v:imagedata r:id="rId20" o:title=""/>
           </v:shape>
-          <o:OLEObject Type="Embed" ProgID="Package" ShapeID="_x0000_i1025" DrawAspect="Icon" ObjectID="_1834247356" r:id="rId21"/>
+          <o:OLEObject Type="Embed" ProgID="Package" ShapeID="_x0000_i1025" DrawAspect="Icon" ObjectID="_1836249289" r:id="rId21"/>
         </w:object>
       </w:r>
       <w:r>
@@ -19144,7 +19148,7 @@
           <v:shape id="_x0000_i1026" type="#_x0000_t75" style="width:76.2pt;height:49.2pt" o:ole="">
             <v:imagedata r:id="rId22" o:title=""/>
           </v:shape>
-          <o:OLEObject Type="Embed" ProgID="Package" ShapeID="_x0000_i1026" DrawAspect="Icon" ObjectID="_1834247357" r:id="rId23"/>
+          <o:OLEObject Type="Embed" ProgID="Package" ShapeID="_x0000_i1026" DrawAspect="Icon" ObjectID="_1836249290" r:id="rId23"/>
         </w:object>
       </w:r>
       <w:r>
@@ -19152,7 +19156,7 @@
           <v:shape id="_x0000_i1027" type="#_x0000_t75" style="width:76.2pt;height:49.2pt" o:ole="">
             <v:imagedata r:id="rId24" o:title=""/>
           </v:shape>
-          <o:OLEObject Type="Embed" ProgID="Package" ShapeID="_x0000_i1027" DrawAspect="Icon" ObjectID="_1834247358" r:id="rId25"/>
+          <o:OLEObject Type="Embed" ProgID="Package" ShapeID="_x0000_i1027" DrawAspect="Icon" ObjectID="_1836249291" r:id="rId25"/>
         </w:object>
       </w:r>
       <w:r>
@@ -19160,7 +19164,7 @@
           <v:shape id="_x0000_i1028" type="#_x0000_t75" style="width:76.2pt;height:49.2pt" o:ole="">
             <v:imagedata r:id="rId26" o:title=""/>
           </v:shape>
-          <o:OLEObject Type="Embed" ProgID="Package" ShapeID="_x0000_i1028" DrawAspect="Icon" ObjectID="_1834247359" r:id="rId27"/>
+          <o:OLEObject Type="Embed" ProgID="Package" ShapeID="_x0000_i1028" DrawAspect="Icon" ObjectID="_1836249292" r:id="rId27"/>
         </w:object>
       </w:r>
       <w:r>
@@ -19168,7 +19172,7 @@
           <v:shape id="_x0000_i1029" type="#_x0000_t75" style="width:76.2pt;height:49.2pt" o:ole="">
             <v:imagedata r:id="rId28" o:title=""/>
           </v:shape>
-          <o:OLEObject Type="Embed" ProgID="Package" ShapeID="_x0000_i1029" DrawAspect="Icon" ObjectID="_1834247360" r:id="rId29"/>
+          <o:OLEObject Type="Embed" ProgID="Package" ShapeID="_x0000_i1029" DrawAspect="Icon" ObjectID="_1836249293" r:id="rId29"/>
         </w:object>
       </w:r>
       <w:r>
@@ -19176,7 +19180,7 @@
           <v:shape id="_x0000_i1030" type="#_x0000_t75" style="width:76.2pt;height:49.2pt" o:ole="">
             <v:imagedata r:id="rId30" o:title=""/>
           </v:shape>
-          <o:OLEObject Type="Embed" ProgID="Package" ShapeID="_x0000_i1030" DrawAspect="Icon" ObjectID="_1834247361" r:id="rId31"/>
+          <o:OLEObject Type="Embed" ProgID="Package" ShapeID="_x0000_i1030" DrawAspect="Icon" ObjectID="_1836249294" r:id="rId31"/>
         </w:object>
       </w:r>
       <w:r>
@@ -19184,7 +19188,7 @@
           <v:shape id="_x0000_i1031" type="#_x0000_t75" style="width:76.2pt;height:49.2pt" o:ole="">
             <v:imagedata r:id="rId32" o:title=""/>
           </v:shape>
-          <o:OLEObject Type="Embed" ProgID="Package" ShapeID="_x0000_i1031" DrawAspect="Icon" ObjectID="_1834247362" r:id="rId33"/>
+          <o:OLEObject Type="Embed" ProgID="Package" ShapeID="_x0000_i1031" DrawAspect="Icon" ObjectID="_1836249295" r:id="rId33"/>
         </w:object>
       </w:r>
       <w:r>
@@ -19192,7 +19196,7 @@
           <v:shape id="_x0000_i1032" type="#_x0000_t75" style="width:76.2pt;height:49.2pt" o:ole="">
             <v:imagedata r:id="rId34" o:title=""/>
           </v:shape>
-          <o:OLEObject Type="Embed" ProgID="Package" ShapeID="_x0000_i1032" DrawAspect="Icon" ObjectID="_1834247363" r:id="rId35"/>
+          <o:OLEObject Type="Embed" ProgID="Package" ShapeID="_x0000_i1032" DrawAspect="Icon" ObjectID="_1836249296" r:id="rId35"/>
         </w:object>
       </w:r>
       <w:r>
@@ -19200,7 +19204,7 @@
           <v:shape id="_x0000_i1033" type="#_x0000_t75" style="width:76.2pt;height:49.2pt" o:ole="">
             <v:imagedata r:id="rId36" o:title=""/>
           </v:shape>
-          <o:OLEObject Type="Embed" ProgID="Package" ShapeID="_x0000_i1033" DrawAspect="Icon" ObjectID="_1834247364" r:id="rId37"/>
+          <o:OLEObject Type="Embed" ProgID="Package" ShapeID="_x0000_i1033" DrawAspect="Icon" ObjectID="_1836249297" r:id="rId37"/>
         </w:object>
       </w:r>
       <w:r>
@@ -19208,7 +19212,7 @@
           <v:shape id="_x0000_i1034" type="#_x0000_t75" style="width:76.2pt;height:49.2pt" o:ole="">
             <v:imagedata r:id="rId38" o:title=""/>
           </v:shape>
-          <o:OLEObject Type="Embed" ProgID="Package" ShapeID="_x0000_i1034" DrawAspect="Icon" ObjectID="_1834247365" r:id="rId39"/>
+          <o:OLEObject Type="Embed" ProgID="Package" ShapeID="_x0000_i1034" DrawAspect="Icon" ObjectID="_1836249298" r:id="rId39"/>
         </w:object>
       </w:r>
       <w:r>
@@ -19216,7 +19220,7 @@
           <v:shape id="_x0000_i1035" type="#_x0000_t75" style="width:76.2pt;height:49.2pt" o:ole="">
             <v:imagedata r:id="rId40" o:title=""/>
           </v:shape>
-          <o:OLEObject Type="Embed" ProgID="Package" ShapeID="_x0000_i1035" DrawAspect="Icon" ObjectID="_1834247366" r:id="rId41"/>
+          <o:OLEObject Type="Embed" ProgID="Package" ShapeID="_x0000_i1035" DrawAspect="Icon" ObjectID="_1836249299" r:id="rId41"/>
         </w:object>
       </w:r>
       <w:r>
@@ -19224,7 +19228,7 @@
           <v:shape id="_x0000_i1036" type="#_x0000_t75" style="width:76.2pt;height:49.2pt" o:ole="">
             <v:imagedata r:id="rId42" o:title=""/>
           </v:shape>
-          <o:OLEObject Type="Embed" ProgID="Package" ShapeID="_x0000_i1036" DrawAspect="Icon" ObjectID="_1834247367" r:id="rId43"/>
+          <o:OLEObject Type="Embed" ProgID="Package" ShapeID="_x0000_i1036" DrawAspect="Icon" ObjectID="_1836249300" r:id="rId43"/>
         </w:object>
       </w:r>
       <w:r>
@@ -19232,7 +19236,7 @@
           <v:shape id="_x0000_i1037" type="#_x0000_t75" style="width:76.2pt;height:49.2pt" o:ole="">
             <v:imagedata r:id="rId44" o:title=""/>
           </v:shape>
-          <o:OLEObject Type="Embed" ProgID="Package" ShapeID="_x0000_i1037" DrawAspect="Icon" ObjectID="_1834247368" r:id="rId45"/>
+          <o:OLEObject Type="Embed" ProgID="Package" ShapeID="_x0000_i1037" DrawAspect="Icon" ObjectID="_1836249301" r:id="rId45"/>
         </w:object>
       </w:r>
       <w:r>
@@ -19240,7 +19244,7 @@
           <v:shape id="_x0000_i1038" type="#_x0000_t75" style="width:76.2pt;height:49.2pt" o:ole="">
             <v:imagedata r:id="rId46" o:title=""/>
           </v:shape>
-          <o:OLEObject Type="Embed" ProgID="Package" ShapeID="_x0000_i1038" DrawAspect="Icon" ObjectID="_1834247369" r:id="rId47"/>
+          <o:OLEObject Type="Embed" ProgID="Package" ShapeID="_x0000_i1038" DrawAspect="Icon" ObjectID="_1836249302" r:id="rId47"/>
         </w:object>
       </w:r>
       <w:r>
@@ -19248,7 +19252,7 @@
           <v:shape id="_x0000_i1039" type="#_x0000_t75" style="width:76.2pt;height:49.2pt" o:ole="">
             <v:imagedata r:id="rId48" o:title=""/>
           </v:shape>
-          <o:OLEObject Type="Embed" ProgID="Package" ShapeID="_x0000_i1039" DrawAspect="Icon" ObjectID="_1834247370" r:id="rId49"/>
+          <o:OLEObject Type="Embed" ProgID="Package" ShapeID="_x0000_i1039" DrawAspect="Icon" ObjectID="_1836249303" r:id="rId49"/>
         </w:object>
       </w:r>
       <w:r>
@@ -19256,7 +19260,7 @@
           <v:shape id="_x0000_i1040" type="#_x0000_t75" style="width:76.2pt;height:49.2pt" o:ole="">
             <v:imagedata r:id="rId50" o:title=""/>
           </v:shape>
-          <o:OLEObject Type="Embed" ProgID="Package" ShapeID="_x0000_i1040" DrawAspect="Icon" ObjectID="_1834247371" r:id="rId51"/>
+          <o:OLEObject Type="Embed" ProgID="Package" ShapeID="_x0000_i1040" DrawAspect="Icon" ObjectID="_1836249304" r:id="rId51"/>
         </w:object>
       </w:r>
       <w:r>
@@ -19264,7 +19268,7 @@
           <v:shape id="_x0000_i1041" type="#_x0000_t75" style="width:76.2pt;height:49.2pt" o:ole="">
             <v:imagedata r:id="rId52" o:title=""/>
           </v:shape>
-          <o:OLEObject Type="Embed" ProgID="Package" ShapeID="_x0000_i1041" DrawAspect="Icon" ObjectID="_1834247372" r:id="rId53"/>
+          <o:OLEObject Type="Embed" ProgID="Package" ShapeID="_x0000_i1041" DrawAspect="Icon" ObjectID="_1836249305" r:id="rId53"/>
         </w:object>
       </w:r>
       <w:r>
@@ -19272,11 +19276,24 @@
           <v:shape id="_x0000_i1042" type="#_x0000_t75" style="width:76.2pt;height:49.2pt" o:ole="">
             <v:imagedata r:id="rId54" o:title=""/>
           </v:shape>
-          <o:OLEObject Type="Embed" ProgID="Package" ShapeID="_x0000_i1042" DrawAspect="Icon" ObjectID="_1834247373" r:id="rId55"/>
+          <o:OLEObject Type="Embed" ProgID="Package" ShapeID="_x0000_i1042" DrawAspect="Icon" ObjectID="_1836249306" r:id="rId55"/>
         </w:object>
       </w:r>
-      <w:r>
-        <w:t>paginaID].bat, nella maggioranza dei casi non viene indentata correttamente</w:t>
+      <w:proofErr w:type="spellStart"/>
+      <w:r>
+        <w:t>paginaID</w:t>
+      </w:r>
+      <w:proofErr w:type="spellEnd"/>
+      <w:r>
+        <w:t>].</w:t>
+      </w:r>
+      <w:proofErr w:type="spellStart"/>
+      <w:r>
+        <w:t>bat</w:t>
+      </w:r>
+      <w:proofErr w:type="spellEnd"/>
+      <w:r>
+        <w:t>, nella maggioranza dei casi non viene indentata correttamente</w:t>
       </w:r>
       <w:r>
         <w:t>, si è provveduto a gestire tramite files</w:t>
@@ -33039,6 +33056,14 @@
     <w:abstractNumId w:val="31"/>
   </w:num>
 </w:numbering>
+</file>
+
+<file path=word/people.xml><?xml version="1.0" encoding="utf-8"?>
+<w15:people xmlns:wpc="http://schemas.microsoft.com/office/word/2010/wordprocessingCanvas" xmlns:cx="http://schemas.microsoft.com/office/drawing/2014/chartex" xmlns:cx1="http://schemas.microsoft.com/office/drawing/2015/9/8/chartex" xmlns:cx2="http://schemas.microsoft.com/office/drawing/2015/10/21/chartex" xmlns:cx3="http://schemas.microsoft.com/office/drawing/2016/5/9/chartex" xmlns:cx4="http://schemas.microsoft.com/office/drawing/2016/5/10/chartex" xmlns:cx5="http://schemas.microsoft.com/office/drawing/2016/5/11/chartex" xmlns:cx6="http://schemas.microsoft.com/office/drawing/2016/5/12/chartex" xmlns:cx7="http://schemas.microsoft.com/office/drawing/2016/5/13/chartex" xmlns:cx8="http://schemas.microsoft.com/office/drawing/2016/5/14/chartex" xmlns:mc="http://schemas.openxmlformats.org/markup-compatibility/2006" xmlns:aink="http://schemas.microsoft.com/office/drawing/2016/ink" xmlns:am3d="http://schemas.microsoft.com/office/drawing/2017/model3d" xmlns:o="urn:schemas-microsoft-com:office:office" xmlns:oel="http://schemas.microsoft.com/office/2019/extlst" xmlns:r="http://schemas.openxmlformats.org/officeDocument/2006/relationships" xmlns:m="http://schemas.openxmlformats.org/officeDocument/2006/math" xmlns:v="urn:schemas-microsoft-com:vml" xmlns:wp14="http://schemas.microsoft.com/office/word/2010/wordprocessingDrawing" xmlns:wp="http://schemas.openxmlformats.org/drawingml/2006/wordprocessingDrawing" xmlns:w10="urn:schemas-microsoft-com:office:word" xmlns:w="http://schemas.openxmlformats.org/wordprocessingml/2006/main" xmlns:w14="http://schemas.microsoft.com/office/word/2010/wordml" xmlns:w15="http://schemas.microsoft.com/office/word/2012/wordml" xmlns:w16cex="http://schemas.microsoft.com/office/word/2018/wordml/cex" xmlns:w16cid="http://schemas.microsoft.com/office/word/2016/wordml/cid" xmlns:w16="http://schemas.microsoft.com/office/word/2018/wordml" xmlns:w16du="http://schemas.microsoft.com/office/word/2023/wordml/word16du" xmlns:w16sdtdh="http://schemas.microsoft.com/office/word/2020/wordml/sdtdatahash" xmlns:w16sdtfl="http://schemas.microsoft.com/office/word/2024/wordml/sdtformatlock" xmlns:w16se="http://schemas.microsoft.com/office/word/2015/wordml/symex" xmlns:wpg="http://schemas.microsoft.com/office/word/2010/wordprocessingGroup" xmlns:wpi="http://schemas.microsoft.com/office/word/2010/wordprocessingInk" xmlns:wne="http://schemas.microsoft.com/office/word/2006/wordml" xmlns:wps="http://schemas.microsoft.com/office/word/2010/wordprocessingShape" mc:Ignorable="w14 w15 w16se w16cid w16 w16cex w16sdtdh w16sdtfl w16du wp14">
+  <w15:person w15:author="Ruggero Rostirolla">
+    <w15:presenceInfo w15:providerId="Windows Live" w15:userId="4583d44d18129778"/>
+  </w15:person>
+</w15:people>
 </file>
 
 <file path=word/styles.xml><?xml version="1.0" encoding="utf-8"?>

</xml_diff>